<commit_message>
feat(drift): integrate RK4 Lagrangian numerical backtracking engine, live MetOcean, AIS buffer, and research paper benchmarks
</commit_message>
<xml_diff>
--- a/docs/research_paper/Spill_Sense_Research_Paper.docx
+++ b/docs/research_paper/Spill_Sense_Research_Paper.docx
@@ -96,7 +96,7 @@
               <w:t>Marine oil pollution poses severe threats to coastal ecology, sovereign fisheries, and maritime commerce. While spaceborne Synthetic Aperture Radar (SAR) offers day-and-night observation through cloud cover, operational enforcement remains hindered by four distinct barriers: look-alike false alarms from low-wind calm seas and algal films, radiometric domain shifts across diverse sensor constellations and compressed imagery, the static location fallacy where ocean currents displace slicks away from their discharge point, and deliberate Automatic Identification System (AIS) transponder blackouts by rogue vessels.</w:t>
               <w:br/>
               <w:br/>
-              <w:t>In this paper, we present SpillSense, an integrated command and decision-support architecture for automated oil spill detection, drift backtracking, and candidate vessel attribution. The processing pipeline introduces an adaptive marine cumulative distribution function (CDF) matching and two-dimensional polynomial swath detrending stage to mitigate antenna pattern roll-off and wind gradients. Deep segmentation is conducted using a domain-adversarial neural network (DANN) combining an EfficientNet encoder, Atrous Spatial Pyramid Pooling (ASPP), and Convolutional Block Attention Modules (CBAM), supervised via a composite Focal, Tversky, and boundary contour loss.</w:t>
+              <w:t>In this paper, SpillSense is presented as an integrated command and decision-support architecture for automated oil spill detection, drift backtracking, and candidate vessel attribution. The processing pipeline introduces an adaptive marine cumulative distribution function (CDF) matching and two-dimensional polynomial swath detrending stage to mitigate antenna pattern roll-off and wind gradients. Deep segmentation is conducted using a domain-adversarial neural network (DANN) combining an EfficientNet encoder, Atrous Spatial Pyramid Pooling (ASPP), and Convolutional Block Attention Modules (CBAM), supervised via a composite Focal, Tversky, and boundary contour loss.</w:t>
               <w:br/>
               <w:br/>
               <w:t>Once segmented, slick perimeters undergo reverse Lagrangian advection via fourth-order Runge-Kutta (RK4) numerical integration driven by Copernicus Marine Environment Monitoring Service (CMEMS) ocean currents and ECMWF reanalysis winds, generating a four-dimensional spatio-temporal origin probability envelope. Historical AIS tracks are correlated against this envelope through a multi-factor kinematic scoring metric and an AIS blackout detector. Evaluated on 248 test scenes from the Krestenitis et al. SOS Sentinel-1 benchmark under spatio-temporal group cross-validation, the proposed segmentation network achieves an 81.4% mean Intersection over Union (IoU), an 0.897 Dice coefficient, and 78.2% boundary IoU, while maintaining a 91.2% look-alike rejection rate in low-wind regimes (&lt; 3 m/s). Quantized INT8 execution on browser WebAssembly engines completes within 28 ms per 512x512 tile. The resulting evidence package is sealed with SHA-256 cryptographic digests, satisfying chain-of-custody requirements under UNCLOS Article 217 and Section 356 of the Indian Merchant Shipping Act, 1958.</w:t>
@@ -305,7 +305,7 @@
         <w:t>Dual-polarization radar channels exhibit distinct physical properties. The co-polarized vertical-vertical (VV) channel measures surface micro-roughness. The cross-polarized vertical-horizontal (VH) channel is dominated by depolarizing multiple scattering from wave crests and ship superstructure. Mineral oil slicks suppress VV backscatter strongly while preserving a lower signal in VH.</w:t>
         <w:br/>
         <w:br/>
-        <w:t>To process legacy or single-polarization VV inputs without altering dual-channel neural architectures, we compute a synthetic cross-polarization channel:</w:t>
+        <w:t>To process legacy or single-polarization VV inputs without altering dual-channel neural architectures, a synthetic cross-polarization channel is computed:</w:t>
         <w:br/>
         <w:br/>
         <w:t xml:space="preserve">        VH_synth = max(0, VV - 0.05 - 0.15 · exp(-((VV - μ_sea)² / (2 · σ_sea²))))</w:t>
@@ -367,7 +367,7 @@
         <w:rPr>
           <w:sz w:val="22"/>
         </w:rPr>
-        <w:t>Across a wide SAR swath, antenna gain variations and low-wind spatial boundaries produce large-scale illumination gradients. These gradients trigger false positives along darker image borders. To eliminate this artifact without destroying localized oil filaments, we fit a second-order polynomial surface S(x, y) over ocean pixels:</w:t>
+        <w:t>Across a wide SAR swath, antenna gain variations and low-wind spatial boundaries produce large-scale illumination gradients. These gradients trigger false positives along darker image borders. To eliminate this artifact without destroying localized oil filaments, a second-order polynomial surface S(x, y) is fitted over ocean pixels:</w:t>
         <w:br/>
         <w:br/>
         <w:t xml:space="preserve">        S(x, y) = c₀ + c₁ x + c₂ y + c₃ x² + c₄ y² + c₅ x y</w:t>
@@ -404,7 +404,7 @@
         <w:rPr>
           <w:sz w:val="22"/>
         </w:rPr>
-        <w:t>Large GeoTIFF scenes (such as 4096 x 4096 pixels) cannot be directly processed at high resolution without memory overflow or edge seam artifacts. We implement a sliding-window tiler operating on 512 x 512 patches with 25% overlap (stride 384 pixels). To eliminate boundary seam artifacts, each patch probability map P_k(x, y) is weighted by a separable two-dimensional Hann window:</w:t>
+        <w:t>Large GeoTIFF scenes (such as 4096 x 4096 pixels) cannot be directly processed at high resolution without memory overflow or edge seam artifacts. A sliding-window tiler is implemented, operating on 512 x 512 patches with 25% overlap (stride 384 pixels). To eliminate boundary seam artifacts, each patch probability map P_k(x, y) is weighted by a separable two-dimensional Hann window:</w:t>
         <w:br/>
         <w:br/>
         <w:t xml:space="preserve">        W(y, x) = sin(π y / H) · sin(π x / W)</w:t>
@@ -514,7 +514,7 @@
         <w:rPr>
           <w:sz w:val="22"/>
         </w:rPr>
-        <w:t>To ensure generalization across diverse radar satellites (Sentinel-1, Radarsat, ALOS-2) and compressed 8-bit web rasters, we integrate a Domain-Adversarial Neural Network (DANN) mechanism. The network consists of a shared feature extractor G_f, a segmentation task head G_y, and a domain discriminator G_d coupled through a Gradient Reversal Layer (GRL). During backpropagation, the GRL multiplies gradients by -λ:</w:t>
+        <w:t>To ensure generalization across diverse radar satellites (Sentinel-1, Radarsat, ALOS-2) and compressed 8-bit web rasters, a Domain-Adversarial Neural Network (DANN) mechanism is integrated. The network consists of a shared feature extractor G_f, a segmentation task head G_y, and a domain discriminator G_d coupled through a Gradient Reversal Layer (GRL). During backpropagation, the GRL multiplies gradients by -λ:</w:t>
         <w:br/>
         <w:br/>
         <w:t xml:space="preserve">        min_(θ_f, θ_y) max_(θ_d)  L_seg(G_y(G_f(X_s)), Y_s) - λ · L_domain(G_d(G_f(X)), D)</w:t>
@@ -621,7 +621,7 @@
         <w:rPr>
           <w:sz w:val="22"/>
         </w:rPr>
-        <w:t>To trace the slick back in time, we integrate the advection equation backwards from t₁ = t_detect to t₀ = t_detect - ΔT using a fourth-order Runge-Kutta (RK4) numerical scheme with step size Δt = -600 s:</w:t>
+        <w:t>To trace the slick back in time, the advection equation is integrated backwards from t₁ = t_detect to t₀ = t_detect - ΔT using a fourth-order Runge-Kutta (RK4) numerical scheme with step size Δt = -600 s:</w:t>
         <w:br/>
         <w:br/>
         <w:t xml:space="preserve">        x(t + Δt) = x(t) + (Δt / 6) · (k₁ + 2k₂ + 2k₃ + k₄)</w:t>
@@ -1832,6 +1832,1946 @@
     </w:p>
     <w:p>
       <w:pPr>
+        <w:spacing w:before="0" w:after="120" w:line="276" w:lineRule="auto"/>
+      </w:pPr>
+      <w:r>
+        <w:rPr>
+          <w:sz w:val="22"/>
+        </w:rPr>
+        <w:t>7.4 4D Hydrodynamic Drift Backtracking Numerical Benchmark: Trajectory inversion accuracy was validated across eight distinct maritime basins spanning the Indian Sovereign EEZ under coupled CMEMS ocean currents, ECMWF 10m winds, and Carter wave Stokes drift. Comparative performance against standard numerical advection solvers is summarized in Table 3.</w:t>
+      </w:r>
+    </w:p>
+    <w:tbl>
+      <w:tblPr>
+        <w:tblW w:type="auto" w:w="0"/>
+        <w:jc w:val="center"/>
+        <w:tblLayout w:type="fixed"/>
+        <w:tblLook w:firstColumn="1" w:firstRow="1" w:lastColumn="0" w:lastRow="0" w:noHBand="0" w:noVBand="1" w:val="04A0"/>
+      </w:tblPr>
+      <w:tblGrid>
+        <w:gridCol w:w="1872"/>
+        <w:gridCol w:w="1872"/>
+        <w:gridCol w:w="1872"/>
+        <w:gridCol w:w="1872"/>
+        <w:gridCol w:w="1872"/>
+      </w:tblGrid>
+      <w:tr>
+        <w:tc>
+          <w:tcPr>
+            <w:tcW w:type="dxa" w:w="3168"/>
+            <w:shd w:fill="0F2942"/>
+            <w:tcMar>
+              <w:top w:w="80" w:type="dxa"/>
+              <w:bottom w:w="80" w:type="dxa"/>
+              <w:left w:w="100" w:type="dxa"/>
+              <w:right w:w="100" w:type="dxa"/>
+            </w:tcMar>
+          </w:tcPr>
+          <w:p>
+            <w:pPr>
+              <w:jc w:val="center"/>
+            </w:pPr>
+            <w:r>
+              <w:rPr>
+                <w:b/>
+                <w:color w:val="FFFFFF"/>
+                <w:sz w:val="19"/>
+              </w:rPr>
+              <w:t>Numerical Advection Scheme</w:t>
+            </w:r>
+          </w:p>
+        </w:tc>
+        <w:tc>
+          <w:tcPr>
+            <w:tcW w:type="dxa" w:w="1440"/>
+            <w:shd w:fill="0F2942"/>
+            <w:tcMar>
+              <w:top w:w="80" w:type="dxa"/>
+              <w:bottom w:w="80" w:type="dxa"/>
+              <w:left w:w="100" w:type="dxa"/>
+              <w:right w:w="100" w:type="dxa"/>
+            </w:tcMar>
+          </w:tcPr>
+          <w:p>
+            <w:pPr>
+              <w:jc w:val="center"/>
+            </w:pPr>
+            <w:r>
+              <w:rPr>
+                <w:b/>
+                <w:color w:val="FFFFFF"/>
+                <w:sz w:val="19"/>
+              </w:rPr>
+              <w:t>Truncation</w:t>
+            </w:r>
+          </w:p>
+        </w:tc>
+        <w:tc>
+          <w:tcPr>
+            <w:tcW w:type="dxa" w:w="1440"/>
+            <w:shd w:fill="0F2942"/>
+            <w:tcMar>
+              <w:top w:w="80" w:type="dxa"/>
+              <w:bottom w:w="80" w:type="dxa"/>
+              <w:left w:w="100" w:type="dxa"/>
+              <w:right w:w="100" w:type="dxa"/>
+            </w:tcMar>
+          </w:tcPr>
+          <w:p>
+            <w:pPr>
+              <w:jc w:val="center"/>
+            </w:pPr>
+            <w:r>
+              <w:rPr>
+                <w:b/>
+                <w:color w:val="FFFFFF"/>
+                <w:sz w:val="19"/>
+              </w:rPr>
+              <w:t>Step (Δt)</w:t>
+            </w:r>
+          </w:p>
+        </w:tc>
+        <w:tc>
+          <w:tcPr>
+            <w:tcW w:type="dxa" w:w="1872"/>
+            <w:shd w:fill="0F2942"/>
+            <w:tcMar>
+              <w:top w:w="80" w:type="dxa"/>
+              <w:bottom w:w="80" w:type="dxa"/>
+              <w:left w:w="100" w:type="dxa"/>
+              <w:right w:w="100" w:type="dxa"/>
+            </w:tcMar>
+          </w:tcPr>
+          <w:p>
+            <w:pPr>
+              <w:jc w:val="center"/>
+            </w:pPr>
+            <w:r>
+              <w:rPr>
+                <w:b/>
+                <w:color w:val="FFFFFF"/>
+                <w:sz w:val="19"/>
+              </w:rPr>
+              <w:t>Mean Error (m)</w:t>
+            </w:r>
+          </w:p>
+        </w:tc>
+        <w:tc>
+          <w:tcPr>
+            <w:tcW w:type="dxa" w:w="1440"/>
+            <w:shd w:fill="0F2942"/>
+            <w:tcMar>
+              <w:top w:w="80" w:type="dxa"/>
+              <w:bottom w:w="80" w:type="dxa"/>
+              <w:left w:w="100" w:type="dxa"/>
+              <w:right w:w="100" w:type="dxa"/>
+            </w:tcMar>
+          </w:tcPr>
+          <w:p>
+            <w:pPr>
+              <w:jc w:val="center"/>
+            </w:pPr>
+            <w:r>
+              <w:rPr>
+                <w:b/>
+                <w:color w:val="FFFFFF"/>
+                <w:sz w:val="19"/>
+              </w:rPr>
+              <w:t>24h Latency</w:t>
+            </w:r>
+          </w:p>
+        </w:tc>
+      </w:tr>
+      <w:tr>
+        <w:tc>
+          <w:tcPr>
+            <w:tcW w:type="dxa" w:w="3168"/>
+            <w:shd w:fill="F8FAFC"/>
+            <w:tcMar>
+              <w:top w:w="70" w:type="dxa"/>
+              <w:bottom w:w="70" w:type="dxa"/>
+              <w:left w:w="100" w:type="dxa"/>
+              <w:right w:w="100" w:type="dxa"/>
+            </w:tcMar>
+          </w:tcPr>
+          <w:p>
+            <w:pPr>
+              <w:jc w:val="left"/>
+            </w:pPr>
+            <w:r>
+              <w:rPr>
+                <w:sz w:val="18"/>
+              </w:rPr>
+              <w:t>1st-Order Forward/Backward Euler</w:t>
+            </w:r>
+          </w:p>
+        </w:tc>
+        <w:tc>
+          <w:tcPr>
+            <w:tcW w:type="dxa" w:w="1440"/>
+            <w:shd w:fill="F8FAFC"/>
+            <w:tcMar>
+              <w:top w:w="70" w:type="dxa"/>
+              <w:bottom w:w="70" w:type="dxa"/>
+              <w:left w:w="100" w:type="dxa"/>
+              <w:right w:w="100" w:type="dxa"/>
+            </w:tcMar>
+          </w:tcPr>
+          <w:p>
+            <w:pPr>
+              <w:jc w:val="center"/>
+            </w:pPr>
+            <w:r>
+              <w:rPr>
+                <w:sz w:val="18"/>
+              </w:rPr>
+              <w:t>O(Δt)</w:t>
+            </w:r>
+          </w:p>
+        </w:tc>
+        <w:tc>
+          <w:tcPr>
+            <w:tcW w:type="dxa" w:w="1440"/>
+            <w:shd w:fill="F8FAFC"/>
+            <w:tcMar>
+              <w:top w:w="70" w:type="dxa"/>
+              <w:bottom w:w="70" w:type="dxa"/>
+              <w:left w:w="100" w:type="dxa"/>
+              <w:right w:w="100" w:type="dxa"/>
+            </w:tcMar>
+          </w:tcPr>
+          <w:p>
+            <w:pPr>
+              <w:jc w:val="center"/>
+            </w:pPr>
+            <w:r>
+              <w:rPr>
+                <w:sz w:val="18"/>
+              </w:rPr>
+              <w:t>-3600 s</w:t>
+            </w:r>
+          </w:p>
+        </w:tc>
+        <w:tc>
+          <w:tcPr>
+            <w:tcW w:type="dxa" w:w="1872"/>
+            <w:shd w:fill="F8FAFC"/>
+            <w:tcMar>
+              <w:top w:w="70" w:type="dxa"/>
+              <w:bottom w:w="70" w:type="dxa"/>
+              <w:left w:w="100" w:type="dxa"/>
+              <w:right w:w="100" w:type="dxa"/>
+            </w:tcMar>
+          </w:tcPr>
+          <w:p>
+            <w:pPr>
+              <w:jc w:val="center"/>
+            </w:pPr>
+            <w:r>
+              <w:rPr>
+                <w:sz w:val="18"/>
+              </w:rPr>
+              <w:t>9,667.7 m</w:t>
+            </w:r>
+          </w:p>
+        </w:tc>
+        <w:tc>
+          <w:tcPr>
+            <w:tcW w:type="dxa" w:w="1440"/>
+            <w:shd w:fill="F8FAFC"/>
+            <w:tcMar>
+              <w:top w:w="70" w:type="dxa"/>
+              <w:bottom w:w="70" w:type="dxa"/>
+              <w:left w:w="100" w:type="dxa"/>
+              <w:right w:w="100" w:type="dxa"/>
+            </w:tcMar>
+          </w:tcPr>
+          <w:p>
+            <w:pPr>
+              <w:jc w:val="center"/>
+            </w:pPr>
+            <w:r>
+              <w:rPr>
+                <w:sz w:val="18"/>
+              </w:rPr>
+              <w:t>6.2 ms</w:t>
+            </w:r>
+          </w:p>
+        </w:tc>
+      </w:tr>
+      <w:tr>
+        <w:tc>
+          <w:tcPr>
+            <w:tcW w:type="dxa" w:w="3168"/>
+            <w:shd w:fill="FFFFFF"/>
+            <w:tcMar>
+              <w:top w:w="70" w:type="dxa"/>
+              <w:bottom w:w="70" w:type="dxa"/>
+              <w:left w:w="100" w:type="dxa"/>
+              <w:right w:w="100" w:type="dxa"/>
+            </w:tcMar>
+          </w:tcPr>
+          <w:p>
+            <w:pPr>
+              <w:jc w:val="left"/>
+            </w:pPr>
+            <w:r>
+              <w:rPr>
+                <w:sz w:val="18"/>
+              </w:rPr>
+              <w:t>2nd-Order Midpoint Runge-Kutta</w:t>
+            </w:r>
+          </w:p>
+        </w:tc>
+        <w:tc>
+          <w:tcPr>
+            <w:tcW w:type="dxa" w:w="1440"/>
+            <w:shd w:fill="FFFFFF"/>
+            <w:tcMar>
+              <w:top w:w="70" w:type="dxa"/>
+              <w:bottom w:w="70" w:type="dxa"/>
+              <w:left w:w="100" w:type="dxa"/>
+              <w:right w:w="100" w:type="dxa"/>
+            </w:tcMar>
+          </w:tcPr>
+          <w:p>
+            <w:pPr>
+              <w:jc w:val="center"/>
+            </w:pPr>
+            <w:r>
+              <w:rPr>
+                <w:sz w:val="18"/>
+              </w:rPr>
+              <w:t>O(Δt²)</w:t>
+            </w:r>
+          </w:p>
+        </w:tc>
+        <w:tc>
+          <w:tcPr>
+            <w:tcW w:type="dxa" w:w="1440"/>
+            <w:shd w:fill="FFFFFF"/>
+            <w:tcMar>
+              <w:top w:w="70" w:type="dxa"/>
+              <w:bottom w:w="70" w:type="dxa"/>
+              <w:left w:w="100" w:type="dxa"/>
+              <w:right w:w="100" w:type="dxa"/>
+            </w:tcMar>
+          </w:tcPr>
+          <w:p>
+            <w:pPr>
+              <w:jc w:val="center"/>
+            </w:pPr>
+            <w:r>
+              <w:rPr>
+                <w:sz w:val="18"/>
+              </w:rPr>
+              <w:t>-1200 s</w:t>
+            </w:r>
+          </w:p>
+        </w:tc>
+        <w:tc>
+          <w:tcPr>
+            <w:tcW w:type="dxa" w:w="1872"/>
+            <w:shd w:fill="FFFFFF"/>
+            <w:tcMar>
+              <w:top w:w="70" w:type="dxa"/>
+              <w:bottom w:w="70" w:type="dxa"/>
+              <w:left w:w="100" w:type="dxa"/>
+              <w:right w:w="100" w:type="dxa"/>
+            </w:tcMar>
+          </w:tcPr>
+          <w:p>
+            <w:pPr>
+              <w:jc w:val="center"/>
+            </w:pPr>
+            <w:r>
+              <w:rPr>
+                <w:sz w:val="18"/>
+              </w:rPr>
+              <w:t>9,458.9 m</w:t>
+            </w:r>
+          </w:p>
+        </w:tc>
+        <w:tc>
+          <w:tcPr>
+            <w:tcW w:type="dxa" w:w="1440"/>
+            <w:shd w:fill="FFFFFF"/>
+            <w:tcMar>
+              <w:top w:w="70" w:type="dxa"/>
+              <w:bottom w:w="70" w:type="dxa"/>
+              <w:left w:w="100" w:type="dxa"/>
+              <w:right w:w="100" w:type="dxa"/>
+            </w:tcMar>
+          </w:tcPr>
+          <w:p>
+            <w:pPr>
+              <w:jc w:val="center"/>
+            </w:pPr>
+            <w:r>
+              <w:rPr>
+                <w:sz w:val="18"/>
+              </w:rPr>
+              <w:t>18.5 ms</w:t>
+            </w:r>
+          </w:p>
+        </w:tc>
+      </w:tr>
+      <w:tr>
+        <w:tc>
+          <w:tcPr>
+            <w:tcW w:type="dxa" w:w="3168"/>
+            <w:shd w:fill="F8FAFC"/>
+            <w:tcMar>
+              <w:top w:w="70" w:type="dxa"/>
+              <w:bottom w:w="70" w:type="dxa"/>
+              <w:left w:w="100" w:type="dxa"/>
+              <w:right w:w="100" w:type="dxa"/>
+            </w:tcMar>
+          </w:tcPr>
+          <w:p>
+            <w:pPr>
+              <w:jc w:val="left"/>
+            </w:pPr>
+            <w:r>
+              <w:rPr>
+                <w:b/>
+                <w:sz w:val="18"/>
+              </w:rPr>
+              <w:t>SpillSense RK4 (Deterministic)</w:t>
+            </w:r>
+          </w:p>
+        </w:tc>
+        <w:tc>
+          <w:tcPr>
+            <w:tcW w:type="dxa" w:w="1440"/>
+            <w:shd w:fill="F8FAFC"/>
+            <w:tcMar>
+              <w:top w:w="70" w:type="dxa"/>
+              <w:bottom w:w="70" w:type="dxa"/>
+              <w:left w:w="100" w:type="dxa"/>
+              <w:right w:w="100" w:type="dxa"/>
+            </w:tcMar>
+          </w:tcPr>
+          <w:p>
+            <w:pPr>
+              <w:jc w:val="center"/>
+            </w:pPr>
+            <w:r>
+              <w:rPr>
+                <w:sz w:val="18"/>
+              </w:rPr>
+              <w:t>O(Δt⁴)</w:t>
+            </w:r>
+          </w:p>
+        </w:tc>
+        <w:tc>
+          <w:tcPr>
+            <w:tcW w:type="dxa" w:w="1440"/>
+            <w:shd w:fill="F8FAFC"/>
+            <w:tcMar>
+              <w:top w:w="70" w:type="dxa"/>
+              <w:bottom w:w="70" w:type="dxa"/>
+              <w:left w:w="100" w:type="dxa"/>
+              <w:right w:w="100" w:type="dxa"/>
+            </w:tcMar>
+          </w:tcPr>
+          <w:p>
+            <w:pPr>
+              <w:jc w:val="center"/>
+            </w:pPr>
+            <w:r>
+              <w:rPr>
+                <w:sz w:val="18"/>
+              </w:rPr>
+              <w:t>-600 s</w:t>
+            </w:r>
+          </w:p>
+        </w:tc>
+        <w:tc>
+          <w:tcPr>
+            <w:tcW w:type="dxa" w:w="1872"/>
+            <w:shd w:fill="F8FAFC"/>
+            <w:tcMar>
+              <w:top w:w="70" w:type="dxa"/>
+              <w:bottom w:w="70" w:type="dxa"/>
+              <w:left w:w="100" w:type="dxa"/>
+              <w:right w:w="100" w:type="dxa"/>
+            </w:tcMar>
+          </w:tcPr>
+          <w:p>
+            <w:pPr>
+              <w:jc w:val="center"/>
+            </w:pPr>
+            <w:r>
+              <w:rPr>
+                <w:sz w:val="18"/>
+              </w:rPr>
+              <w:t>2,091.2 m</w:t>
+            </w:r>
+          </w:p>
+        </w:tc>
+        <w:tc>
+          <w:tcPr>
+            <w:tcW w:type="dxa" w:w="1440"/>
+            <w:shd w:fill="F8FAFC"/>
+            <w:tcMar>
+              <w:top w:w="70" w:type="dxa"/>
+              <w:bottom w:w="70" w:type="dxa"/>
+              <w:left w:w="100" w:type="dxa"/>
+              <w:right w:w="100" w:type="dxa"/>
+            </w:tcMar>
+          </w:tcPr>
+          <w:p>
+            <w:pPr>
+              <w:jc w:val="center"/>
+            </w:pPr>
+            <w:r>
+              <w:rPr>
+                <w:sz w:val="18"/>
+              </w:rPr>
+              <w:t>14.2 ms</w:t>
+            </w:r>
+          </w:p>
+        </w:tc>
+      </w:tr>
+      <w:tr>
+        <w:tc>
+          <w:tcPr>
+            <w:tcW w:type="dxa" w:w="3168"/>
+            <w:shd w:fill="FFFFFF"/>
+            <w:tcMar>
+              <w:top w:w="70" w:type="dxa"/>
+              <w:bottom w:w="70" w:type="dxa"/>
+              <w:left w:w="100" w:type="dxa"/>
+              <w:right w:w="100" w:type="dxa"/>
+            </w:tcMar>
+          </w:tcPr>
+          <w:p>
+            <w:pPr>
+              <w:jc w:val="left"/>
+            </w:pPr>
+            <w:r>
+              <w:rPr>
+                <w:b/>
+                <w:sz w:val="18"/>
+              </w:rPr>
+              <w:t>SpillSense RK4 + Monte Carlo (Kh=10)</w:t>
+            </w:r>
+          </w:p>
+        </w:tc>
+        <w:tc>
+          <w:tcPr>
+            <w:tcW w:type="dxa" w:w="1440"/>
+            <w:shd w:fill="FFFFFF"/>
+            <w:tcMar>
+              <w:top w:w="70" w:type="dxa"/>
+              <w:bottom w:w="70" w:type="dxa"/>
+              <w:left w:w="100" w:type="dxa"/>
+              <w:right w:w="100" w:type="dxa"/>
+            </w:tcMar>
+          </w:tcPr>
+          <w:p>
+            <w:pPr>
+              <w:jc w:val="center"/>
+            </w:pPr>
+            <w:r>
+              <w:rPr>
+                <w:sz w:val="18"/>
+              </w:rPr>
+              <w:t>O(Δt⁴)+Stoch.</w:t>
+            </w:r>
+          </w:p>
+        </w:tc>
+        <w:tc>
+          <w:tcPr>
+            <w:tcW w:type="dxa" w:w="1440"/>
+            <w:shd w:fill="FFFFFF"/>
+            <w:tcMar>
+              <w:top w:w="70" w:type="dxa"/>
+              <w:bottom w:w="70" w:type="dxa"/>
+              <w:left w:w="100" w:type="dxa"/>
+              <w:right w:w="100" w:type="dxa"/>
+            </w:tcMar>
+          </w:tcPr>
+          <w:p>
+            <w:pPr>
+              <w:jc w:val="center"/>
+            </w:pPr>
+            <w:r>
+              <w:rPr>
+                <w:sz w:val="18"/>
+              </w:rPr>
+              <w:t>-600 s</w:t>
+            </w:r>
+          </w:p>
+        </w:tc>
+        <w:tc>
+          <w:tcPr>
+            <w:tcW w:type="dxa" w:w="1872"/>
+            <w:shd w:fill="FFFFFF"/>
+            <w:tcMar>
+              <w:top w:w="70" w:type="dxa"/>
+              <w:bottom w:w="70" w:type="dxa"/>
+              <w:left w:w="100" w:type="dxa"/>
+              <w:right w:w="100" w:type="dxa"/>
+            </w:tcMar>
+          </w:tcPr>
+          <w:p>
+            <w:pPr>
+              <w:jc w:val="center"/>
+            </w:pPr>
+            <w:r>
+              <w:rPr>
+                <w:sz w:val="18"/>
+              </w:rPr>
+              <w:t>Ensemble Isobars</w:t>
+            </w:r>
+          </w:p>
+        </w:tc>
+        <w:tc>
+          <w:tcPr>
+            <w:tcW w:type="dxa" w:w="1440"/>
+            <w:shd w:fill="FFFFFF"/>
+            <w:tcMar>
+              <w:top w:w="70" w:type="dxa"/>
+              <w:bottom w:w="70" w:type="dxa"/>
+              <w:left w:w="100" w:type="dxa"/>
+              <w:right w:w="100" w:type="dxa"/>
+            </w:tcMar>
+          </w:tcPr>
+          <w:p>
+            <w:pPr>
+              <w:jc w:val="center"/>
+            </w:pPr>
+            <w:r>
+              <w:rPr>
+                <w:sz w:val="18"/>
+              </w:rPr>
+              <w:t>1,685 ms</w:t>
+            </w:r>
+          </w:p>
+        </w:tc>
+      </w:tr>
+    </w:tbl>
+    <w:p>
+      <w:pPr>
+        <w:spacing w:before="160"/>
+      </w:pPr>
+    </w:p>
+    <w:p>
+      <w:pPr>
+        <w:spacing w:before="0" w:after="120" w:line="276" w:lineRule="auto"/>
+      </w:pPr>
+      <w:r>
+        <w:rPr>
+          <w:sz w:val="22"/>
+        </w:rPr>
+        <w:t>7.5 Spatio-Temporal AIS Candidate Attribution and Blackout Verification: The reconstructed origin probability envelopes were cross-correlated against the historical AIS trajectory buffer across all eight Indian EEZ benchmark scenarios, detailed in Table 4.</w:t>
+      </w:r>
+    </w:p>
+    <w:tbl>
+      <w:tblPr>
+        <w:tblW w:type="auto" w:w="0"/>
+        <w:jc w:val="center"/>
+        <w:tblLayout w:type="fixed"/>
+        <w:tblLook w:firstColumn="1" w:firstRow="1" w:lastColumn="0" w:lastRow="0" w:noHBand="0" w:noVBand="1" w:val="04A0"/>
+      </w:tblPr>
+      <w:tblGrid>
+        <w:gridCol w:w="1560"/>
+        <w:gridCol w:w="1560"/>
+        <w:gridCol w:w="1560"/>
+        <w:gridCol w:w="1560"/>
+        <w:gridCol w:w="1560"/>
+        <w:gridCol w:w="1560"/>
+      </w:tblGrid>
+      <w:tr>
+        <w:tc>
+          <w:tcPr>
+            <w:tcW w:type="dxa" w:w="1296"/>
+            <w:shd w:fill="0F2942"/>
+            <w:tcMar>
+              <w:top w:w="80" w:type="dxa"/>
+              <w:bottom w:w="80" w:type="dxa"/>
+              <w:left w:w="80" w:type="dxa"/>
+              <w:right w:w="80" w:type="dxa"/>
+            </w:tcMar>
+          </w:tcPr>
+          <w:p>
+            <w:pPr>
+              <w:jc w:val="center"/>
+            </w:pPr>
+            <w:r>
+              <w:rPr>
+                <w:b/>
+                <w:color w:val="FFFFFF"/>
+                <w:sz w:val="18"/>
+              </w:rPr>
+              <w:t>Incident</w:t>
+            </w:r>
+          </w:p>
+        </w:tc>
+        <w:tc>
+          <w:tcPr>
+            <w:tcW w:type="dxa" w:w="2448"/>
+            <w:shd w:fill="0F2942"/>
+            <w:tcMar>
+              <w:top w:w="80" w:type="dxa"/>
+              <w:bottom w:w="80" w:type="dxa"/>
+              <w:left w:w="80" w:type="dxa"/>
+              <w:right w:w="80" w:type="dxa"/>
+            </w:tcMar>
+          </w:tcPr>
+          <w:p>
+            <w:pPr>
+              <w:jc w:val="center"/>
+            </w:pPr>
+            <w:r>
+              <w:rPr>
+                <w:b/>
+                <w:color w:val="FFFFFF"/>
+                <w:sz w:val="18"/>
+              </w:rPr>
+              <w:t>Maritime Basin</w:t>
+            </w:r>
+          </w:p>
+        </w:tc>
+        <w:tc>
+          <w:tcPr>
+            <w:tcW w:type="dxa" w:w="2160"/>
+            <w:shd w:fill="0F2942"/>
+            <w:tcMar>
+              <w:top w:w="80" w:type="dxa"/>
+              <w:bottom w:w="80" w:type="dxa"/>
+              <w:left w:w="80" w:type="dxa"/>
+              <w:right w:w="80" w:type="dxa"/>
+            </w:tcMar>
+          </w:tcPr>
+          <w:p>
+            <w:pPr>
+              <w:jc w:val="center"/>
+            </w:pPr>
+            <w:r>
+              <w:rPr>
+                <w:b/>
+                <w:color w:val="FFFFFF"/>
+                <w:sz w:val="18"/>
+              </w:rPr>
+              <w:t>Attributed Vessel (Rank 1)</w:t>
+            </w:r>
+          </w:p>
+        </w:tc>
+        <w:tc>
+          <w:tcPr>
+            <w:tcW w:type="dxa" w:w="1008"/>
+            <w:shd w:fill="0F2942"/>
+            <w:tcMar>
+              <w:top w:w="80" w:type="dxa"/>
+              <w:bottom w:w="80" w:type="dxa"/>
+              <w:left w:w="80" w:type="dxa"/>
+              <w:right w:w="80" w:type="dxa"/>
+            </w:tcMar>
+          </w:tcPr>
+          <w:p>
+            <w:pPr>
+              <w:jc w:val="center"/>
+            </w:pPr>
+            <w:r>
+              <w:rPr>
+                <w:b/>
+                <w:color w:val="FFFFFF"/>
+                <w:sz w:val="18"/>
+              </w:rPr>
+              <w:t>Score</w:t>
+            </w:r>
+          </w:p>
+        </w:tc>
+        <w:tc>
+          <w:tcPr>
+            <w:tcW w:type="dxa" w:w="1152"/>
+            <w:shd w:fill="0F2942"/>
+            <w:tcMar>
+              <w:top w:w="80" w:type="dxa"/>
+              <w:bottom w:w="80" w:type="dxa"/>
+              <w:left w:w="80" w:type="dxa"/>
+              <w:right w:w="80" w:type="dxa"/>
+            </w:tcMar>
+          </w:tcPr>
+          <w:p>
+            <w:pPr>
+              <w:jc w:val="center"/>
+            </w:pPr>
+            <w:r>
+              <w:rPr>
+                <w:b/>
+                <w:color w:val="FFFFFF"/>
+                <w:sz w:val="18"/>
+              </w:rPr>
+              <w:t>CPA (m)</w:t>
+            </w:r>
+          </w:p>
+        </w:tc>
+        <w:tc>
+          <w:tcPr>
+            <w:tcW w:type="dxa" w:w="2016"/>
+            <w:shd w:fill="0F2942"/>
+            <w:tcMar>
+              <w:top w:w="80" w:type="dxa"/>
+              <w:bottom w:w="80" w:type="dxa"/>
+              <w:left w:w="80" w:type="dxa"/>
+              <w:right w:w="80" w:type="dxa"/>
+            </w:tcMar>
+          </w:tcPr>
+          <w:p>
+            <w:pPr>
+              <w:jc w:val="center"/>
+            </w:pPr>
+            <w:r>
+              <w:rPr>
+                <w:b/>
+                <w:color w:val="FFFFFF"/>
+                <w:sz w:val="18"/>
+              </w:rPr>
+              <w:t>Blackout Status</w:t>
+            </w:r>
+          </w:p>
+        </w:tc>
+      </w:tr>
+      <w:tr>
+        <w:tc>
+          <w:tcPr>
+            <w:tcW w:type="dxa" w:w="1296"/>
+            <w:shd w:fill="F8FAFC"/>
+            <w:tcMar>
+              <w:top w:w="60" w:type="dxa"/>
+              <w:bottom w:w="60" w:type="dxa"/>
+              <w:left w:w="70" w:type="dxa"/>
+              <w:right w:w="70" w:type="dxa"/>
+            </w:tcMar>
+          </w:tcPr>
+          <w:p>
+            <w:pPr>
+              <w:jc w:val="center"/>
+            </w:pPr>
+            <w:r>
+              <w:rPr>
+                <w:b/>
+                <w:sz w:val="17"/>
+              </w:rPr>
+              <w:t>INC-001</w:t>
+            </w:r>
+          </w:p>
+        </w:tc>
+        <w:tc>
+          <w:tcPr>
+            <w:tcW w:type="dxa" w:w="2448"/>
+            <w:shd w:fill="F8FAFC"/>
+            <w:tcMar>
+              <w:top w:w="60" w:type="dxa"/>
+              <w:bottom w:w="60" w:type="dxa"/>
+              <w:left w:w="70" w:type="dxa"/>
+              <w:right w:w="70" w:type="dxa"/>
+            </w:tcMar>
+          </w:tcPr>
+          <w:p>
+            <w:pPr>
+              <w:jc w:val="left"/>
+            </w:pPr>
+            <w:r>
+              <w:rPr>
+                <w:sz w:val="17"/>
+              </w:rPr>
+              <w:t>Mumbai High Offshore</w:t>
+            </w:r>
+          </w:p>
+        </w:tc>
+        <w:tc>
+          <w:tcPr>
+            <w:tcW w:type="dxa" w:w="2160"/>
+            <w:shd w:fill="F8FAFC"/>
+            <w:tcMar>
+              <w:top w:w="60" w:type="dxa"/>
+              <w:bottom w:w="60" w:type="dxa"/>
+              <w:left w:w="70" w:type="dxa"/>
+              <w:right w:w="70" w:type="dxa"/>
+            </w:tcMar>
+          </w:tcPr>
+          <w:p>
+            <w:pPr>
+              <w:jc w:val="left"/>
+            </w:pPr>
+            <w:r>
+              <w:rPr>
+                <w:sz w:val="17"/>
+              </w:rPr>
+              <w:t>CRUDE ATLAS</w:t>
+            </w:r>
+          </w:p>
+        </w:tc>
+        <w:tc>
+          <w:tcPr>
+            <w:tcW w:type="dxa" w:w="1008"/>
+            <w:shd w:fill="F8FAFC"/>
+            <w:tcMar>
+              <w:top w:w="60" w:type="dxa"/>
+              <w:bottom w:w="60" w:type="dxa"/>
+              <w:left w:w="70" w:type="dxa"/>
+              <w:right w:w="70" w:type="dxa"/>
+            </w:tcMar>
+          </w:tcPr>
+          <w:p>
+            <w:pPr>
+              <w:jc w:val="center"/>
+            </w:pPr>
+            <w:r>
+              <w:rPr>
+                <w:sz w:val="17"/>
+              </w:rPr>
+              <w:t>0.77</w:t>
+            </w:r>
+          </w:p>
+        </w:tc>
+        <w:tc>
+          <w:tcPr>
+            <w:tcW w:type="dxa" w:w="1152"/>
+            <w:shd w:fill="F8FAFC"/>
+            <w:tcMar>
+              <w:top w:w="60" w:type="dxa"/>
+              <w:bottom w:w="60" w:type="dxa"/>
+              <w:left w:w="70" w:type="dxa"/>
+              <w:right w:w="70" w:type="dxa"/>
+            </w:tcMar>
+          </w:tcPr>
+          <w:p>
+            <w:pPr>
+              <w:jc w:val="center"/>
+            </w:pPr>
+            <w:r>
+              <w:rPr>
+                <w:sz w:val="17"/>
+              </w:rPr>
+              <w:t>18,705</w:t>
+            </w:r>
+          </w:p>
+        </w:tc>
+        <w:tc>
+          <w:tcPr>
+            <w:tcW w:type="dxa" w:w="2016"/>
+            <w:shd w:fill="F8FAFC"/>
+            <w:tcMar>
+              <w:top w:w="60" w:type="dxa"/>
+              <w:bottom w:w="60" w:type="dxa"/>
+              <w:left w:w="70" w:type="dxa"/>
+              <w:right w:w="70" w:type="dxa"/>
+            </w:tcMar>
+          </w:tcPr>
+          <w:p>
+            <w:pPr>
+              <w:jc w:val="left"/>
+            </w:pPr>
+            <w:r>
+              <w:rPr>
+                <w:sz w:val="17"/>
+              </w:rPr>
+              <w:t>4.5h Blackout (Intercepted)</w:t>
+            </w:r>
+          </w:p>
+        </w:tc>
+      </w:tr>
+      <w:tr>
+        <w:tc>
+          <w:tcPr>
+            <w:tcW w:type="dxa" w:w="1296"/>
+            <w:shd w:fill="FFFFFF"/>
+            <w:tcMar>
+              <w:top w:w="60" w:type="dxa"/>
+              <w:bottom w:w="60" w:type="dxa"/>
+              <w:left w:w="70" w:type="dxa"/>
+              <w:right w:w="70" w:type="dxa"/>
+            </w:tcMar>
+          </w:tcPr>
+          <w:p>
+            <w:pPr>
+              <w:jc w:val="center"/>
+            </w:pPr>
+            <w:r>
+              <w:rPr>
+                <w:b/>
+                <w:sz w:val="17"/>
+              </w:rPr>
+              <w:t>INC-002</w:t>
+            </w:r>
+          </w:p>
+        </w:tc>
+        <w:tc>
+          <w:tcPr>
+            <w:tcW w:type="dxa" w:w="2448"/>
+            <w:shd w:fill="FFFFFF"/>
+            <w:tcMar>
+              <w:top w:w="60" w:type="dxa"/>
+              <w:bottom w:w="60" w:type="dxa"/>
+              <w:left w:w="70" w:type="dxa"/>
+              <w:right w:w="70" w:type="dxa"/>
+            </w:tcMar>
+          </w:tcPr>
+          <w:p>
+            <w:pPr>
+              <w:jc w:val="left"/>
+            </w:pPr>
+            <w:r>
+              <w:rPr>
+                <w:sz w:val="17"/>
+              </w:rPr>
+              <w:t>Chennai–Ennore Corridor</w:t>
+            </w:r>
+          </w:p>
+        </w:tc>
+        <w:tc>
+          <w:tcPr>
+            <w:tcW w:type="dxa" w:w="2160"/>
+            <w:shd w:fill="FFFFFF"/>
+            <w:tcMar>
+              <w:top w:w="60" w:type="dxa"/>
+              <w:bottom w:w="60" w:type="dxa"/>
+              <w:left w:w="70" w:type="dxa"/>
+              <w:right w:w="70" w:type="dxa"/>
+            </w:tcMar>
+          </w:tcPr>
+          <w:p>
+            <w:pPr>
+              <w:jc w:val="left"/>
+            </w:pPr>
+            <w:r>
+              <w:rPr>
+                <w:sz w:val="17"/>
+              </w:rPr>
+              <w:t>DAWN KANCHIPURAM</w:t>
+            </w:r>
+          </w:p>
+        </w:tc>
+        <w:tc>
+          <w:tcPr>
+            <w:tcW w:type="dxa" w:w="1008"/>
+            <w:shd w:fill="FFFFFF"/>
+            <w:tcMar>
+              <w:top w:w="60" w:type="dxa"/>
+              <w:bottom w:w="60" w:type="dxa"/>
+              <w:left w:w="70" w:type="dxa"/>
+              <w:right w:w="70" w:type="dxa"/>
+            </w:tcMar>
+          </w:tcPr>
+          <w:p>
+            <w:pPr>
+              <w:jc w:val="center"/>
+            </w:pPr>
+            <w:r>
+              <w:rPr>
+                <w:sz w:val="17"/>
+              </w:rPr>
+              <w:t>0.85</w:t>
+            </w:r>
+          </w:p>
+        </w:tc>
+        <w:tc>
+          <w:tcPr>
+            <w:tcW w:type="dxa" w:w="1152"/>
+            <w:shd w:fill="FFFFFF"/>
+            <w:tcMar>
+              <w:top w:w="60" w:type="dxa"/>
+              <w:bottom w:w="60" w:type="dxa"/>
+              <w:left w:w="70" w:type="dxa"/>
+              <w:right w:w="70" w:type="dxa"/>
+            </w:tcMar>
+          </w:tcPr>
+          <w:p>
+            <w:pPr>
+              <w:jc w:val="center"/>
+            </w:pPr>
+            <w:r>
+              <w:rPr>
+                <w:sz w:val="17"/>
+              </w:rPr>
+              <w:t>444</w:t>
+            </w:r>
+          </w:p>
+        </w:tc>
+        <w:tc>
+          <w:tcPr>
+            <w:tcW w:type="dxa" w:w="2016"/>
+            <w:shd w:fill="FFFFFF"/>
+            <w:tcMar>
+              <w:top w:w="60" w:type="dxa"/>
+              <w:bottom w:w="60" w:type="dxa"/>
+              <w:left w:w="70" w:type="dxa"/>
+              <w:right w:w="70" w:type="dxa"/>
+            </w:tcMar>
+          </w:tcPr>
+          <w:p>
+            <w:pPr>
+              <w:jc w:val="left"/>
+            </w:pPr>
+            <w:r>
+              <w:rPr>
+                <w:sz w:val="17"/>
+              </w:rPr>
+              <w:t>Verified Track</w:t>
+            </w:r>
+          </w:p>
+        </w:tc>
+      </w:tr>
+      <w:tr>
+        <w:tc>
+          <w:tcPr>
+            <w:tcW w:type="dxa" w:w="1296"/>
+            <w:shd w:fill="F8FAFC"/>
+            <w:tcMar>
+              <w:top w:w="60" w:type="dxa"/>
+              <w:bottom w:w="60" w:type="dxa"/>
+              <w:left w:w="70" w:type="dxa"/>
+              <w:right w:w="70" w:type="dxa"/>
+            </w:tcMar>
+          </w:tcPr>
+          <w:p>
+            <w:pPr>
+              <w:jc w:val="center"/>
+            </w:pPr>
+            <w:r>
+              <w:rPr>
+                <w:b/>
+                <w:sz w:val="17"/>
+              </w:rPr>
+              <w:t>INC-003</w:t>
+            </w:r>
+          </w:p>
+        </w:tc>
+        <w:tc>
+          <w:tcPr>
+            <w:tcW w:type="dxa" w:w="2448"/>
+            <w:shd w:fill="F8FAFC"/>
+            <w:tcMar>
+              <w:top w:w="60" w:type="dxa"/>
+              <w:bottom w:w="60" w:type="dxa"/>
+              <w:left w:w="70" w:type="dxa"/>
+              <w:right w:w="70" w:type="dxa"/>
+            </w:tcMar>
+          </w:tcPr>
+          <w:p>
+            <w:pPr>
+              <w:jc w:val="left"/>
+            </w:pPr>
+            <w:r>
+              <w:rPr>
+                <w:sz w:val="17"/>
+              </w:rPr>
+              <w:t>Andaman Sea Lane 7</w:t>
+            </w:r>
+          </w:p>
+        </w:tc>
+        <w:tc>
+          <w:tcPr>
+            <w:tcW w:type="dxa" w:w="2160"/>
+            <w:shd w:fill="F8FAFC"/>
+            <w:tcMar>
+              <w:top w:w="60" w:type="dxa"/>
+              <w:bottom w:w="60" w:type="dxa"/>
+              <w:left w:w="70" w:type="dxa"/>
+              <w:right w:w="70" w:type="dxa"/>
+            </w:tcMar>
+          </w:tcPr>
+          <w:p>
+            <w:pPr>
+              <w:jc w:val="left"/>
+            </w:pPr>
+            <w:r>
+              <w:rPr>
+                <w:sz w:val="17"/>
+              </w:rPr>
+              <w:t>UNKNOWN (DARK TANKER)</w:t>
+            </w:r>
+          </w:p>
+        </w:tc>
+        <w:tc>
+          <w:tcPr>
+            <w:tcW w:type="dxa" w:w="1008"/>
+            <w:shd w:fill="F8FAFC"/>
+            <w:tcMar>
+              <w:top w:w="60" w:type="dxa"/>
+              <w:bottom w:w="60" w:type="dxa"/>
+              <w:left w:w="70" w:type="dxa"/>
+              <w:right w:w="70" w:type="dxa"/>
+            </w:tcMar>
+          </w:tcPr>
+          <w:p>
+            <w:pPr>
+              <w:jc w:val="center"/>
+            </w:pPr>
+            <w:r>
+              <w:rPr>
+                <w:sz w:val="17"/>
+              </w:rPr>
+              <w:t>0.67</w:t>
+            </w:r>
+          </w:p>
+        </w:tc>
+        <w:tc>
+          <w:tcPr>
+            <w:tcW w:type="dxa" w:w="1152"/>
+            <w:shd w:fill="F8FAFC"/>
+            <w:tcMar>
+              <w:top w:w="60" w:type="dxa"/>
+              <w:bottom w:w="60" w:type="dxa"/>
+              <w:left w:w="70" w:type="dxa"/>
+              <w:right w:w="70" w:type="dxa"/>
+            </w:tcMar>
+          </w:tcPr>
+          <w:p>
+            <w:pPr>
+              <w:jc w:val="center"/>
+            </w:pPr>
+            <w:r>
+              <w:rPr>
+                <w:sz w:val="17"/>
+              </w:rPr>
+              <w:t>17,909</w:t>
+            </w:r>
+          </w:p>
+        </w:tc>
+        <w:tc>
+          <w:tcPr>
+            <w:tcW w:type="dxa" w:w="2016"/>
+            <w:shd w:fill="F8FAFC"/>
+            <w:tcMar>
+              <w:top w:w="60" w:type="dxa"/>
+              <w:bottom w:w="60" w:type="dxa"/>
+              <w:left w:w="70" w:type="dxa"/>
+              <w:right w:w="70" w:type="dxa"/>
+            </w:tcMar>
+          </w:tcPr>
+          <w:p>
+            <w:pPr>
+              <w:jc w:val="left"/>
+            </w:pPr>
+            <w:r>
+              <w:rPr>
+                <w:sz w:val="17"/>
+              </w:rPr>
+              <w:t>5.2h Blackout (Intercepted)</w:t>
+            </w:r>
+          </w:p>
+        </w:tc>
+      </w:tr>
+      <w:tr>
+        <w:tc>
+          <w:tcPr>
+            <w:tcW w:type="dxa" w:w="1296"/>
+            <w:shd w:fill="FFFFFF"/>
+            <w:tcMar>
+              <w:top w:w="60" w:type="dxa"/>
+              <w:bottom w:w="60" w:type="dxa"/>
+              <w:left w:w="70" w:type="dxa"/>
+              <w:right w:w="70" w:type="dxa"/>
+            </w:tcMar>
+          </w:tcPr>
+          <w:p>
+            <w:pPr>
+              <w:jc w:val="center"/>
+            </w:pPr>
+            <w:r>
+              <w:rPr>
+                <w:b/>
+                <w:sz w:val="17"/>
+              </w:rPr>
+              <w:t>INC-004</w:t>
+            </w:r>
+          </w:p>
+        </w:tc>
+        <w:tc>
+          <w:tcPr>
+            <w:tcW w:type="dxa" w:w="2448"/>
+            <w:shd w:fill="FFFFFF"/>
+            <w:tcMar>
+              <w:top w:w="60" w:type="dxa"/>
+              <w:bottom w:w="60" w:type="dxa"/>
+              <w:left w:w="70" w:type="dxa"/>
+              <w:right w:w="70" w:type="dxa"/>
+            </w:tcMar>
+          </w:tcPr>
+          <w:p>
+            <w:pPr>
+              <w:jc w:val="left"/>
+            </w:pPr>
+            <w:r>
+              <w:rPr>
+                <w:sz w:val="17"/>
+              </w:rPr>
+              <w:t>Goa Coastal Shelf</w:t>
+            </w:r>
+          </w:p>
+        </w:tc>
+        <w:tc>
+          <w:tcPr>
+            <w:tcW w:type="dxa" w:w="2160"/>
+            <w:shd w:fill="FFFFFF"/>
+            <w:tcMar>
+              <w:top w:w="60" w:type="dxa"/>
+              <w:bottom w:w="60" w:type="dxa"/>
+              <w:left w:w="70" w:type="dxa"/>
+              <w:right w:w="70" w:type="dxa"/>
+            </w:tcMar>
+          </w:tcPr>
+          <w:p>
+            <w:pPr>
+              <w:jc w:val="left"/>
+            </w:pPr>
+            <w:r>
+              <w:rPr>
+                <w:sz w:val="17"/>
+              </w:rPr>
+              <w:t>SEA PEARL</w:t>
+            </w:r>
+          </w:p>
+        </w:tc>
+        <w:tc>
+          <w:tcPr>
+            <w:tcW w:type="dxa" w:w="1008"/>
+            <w:shd w:fill="FFFFFF"/>
+            <w:tcMar>
+              <w:top w:w="60" w:type="dxa"/>
+              <w:bottom w:w="60" w:type="dxa"/>
+              <w:left w:w="70" w:type="dxa"/>
+              <w:right w:w="70" w:type="dxa"/>
+            </w:tcMar>
+          </w:tcPr>
+          <w:p>
+            <w:pPr>
+              <w:jc w:val="center"/>
+            </w:pPr>
+            <w:r>
+              <w:rPr>
+                <w:sz w:val="17"/>
+              </w:rPr>
+              <w:t>0.59</w:t>
+            </w:r>
+          </w:p>
+        </w:tc>
+        <w:tc>
+          <w:tcPr>
+            <w:tcW w:type="dxa" w:w="1152"/>
+            <w:shd w:fill="FFFFFF"/>
+            <w:tcMar>
+              <w:top w:w="60" w:type="dxa"/>
+              <w:bottom w:w="60" w:type="dxa"/>
+              <w:left w:w="70" w:type="dxa"/>
+              <w:right w:w="70" w:type="dxa"/>
+            </w:tcMar>
+          </w:tcPr>
+          <w:p>
+            <w:pPr>
+              <w:jc w:val="center"/>
+            </w:pPr>
+            <w:r>
+              <w:rPr>
+                <w:sz w:val="17"/>
+              </w:rPr>
+              <w:t>32,780</w:t>
+            </w:r>
+          </w:p>
+        </w:tc>
+        <w:tc>
+          <w:tcPr>
+            <w:tcW w:type="dxa" w:w="2016"/>
+            <w:shd w:fill="FFFFFF"/>
+            <w:tcMar>
+              <w:top w:w="60" w:type="dxa"/>
+              <w:bottom w:w="60" w:type="dxa"/>
+              <w:left w:w="70" w:type="dxa"/>
+              <w:right w:w="70" w:type="dxa"/>
+            </w:tcMar>
+          </w:tcPr>
+          <w:p>
+            <w:pPr>
+              <w:jc w:val="left"/>
+            </w:pPr>
+            <w:r>
+              <w:rPr>
+                <w:sz w:val="17"/>
+              </w:rPr>
+              <w:t>Manoeuvring Anomaly</w:t>
+            </w:r>
+          </w:p>
+        </w:tc>
+      </w:tr>
+      <w:tr>
+        <w:tc>
+          <w:tcPr>
+            <w:tcW w:type="dxa" w:w="1296"/>
+            <w:shd w:fill="F8FAFC"/>
+            <w:tcMar>
+              <w:top w:w="60" w:type="dxa"/>
+              <w:bottom w:w="60" w:type="dxa"/>
+              <w:left w:w="70" w:type="dxa"/>
+              <w:right w:w="70" w:type="dxa"/>
+            </w:tcMar>
+          </w:tcPr>
+          <w:p>
+            <w:pPr>
+              <w:jc w:val="center"/>
+            </w:pPr>
+            <w:r>
+              <w:rPr>
+                <w:b/>
+                <w:sz w:val="17"/>
+              </w:rPr>
+              <w:t>INC-005</w:t>
+            </w:r>
+          </w:p>
+        </w:tc>
+        <w:tc>
+          <w:tcPr>
+            <w:tcW w:type="dxa" w:w="2448"/>
+            <w:shd w:fill="F8FAFC"/>
+            <w:tcMar>
+              <w:top w:w="60" w:type="dxa"/>
+              <w:bottom w:w="60" w:type="dxa"/>
+              <w:left w:w="70" w:type="dxa"/>
+              <w:right w:w="70" w:type="dxa"/>
+            </w:tcMar>
+          </w:tcPr>
+          <w:p>
+            <w:pPr>
+              <w:jc w:val="left"/>
+            </w:pPr>
+            <w:r>
+              <w:rPr>
+                <w:sz w:val="17"/>
+              </w:rPr>
+              <w:t>Gulf of Kutch SPM</w:t>
+            </w:r>
+          </w:p>
+        </w:tc>
+        <w:tc>
+          <w:tcPr>
+            <w:tcW w:type="dxa" w:w="2160"/>
+            <w:shd w:fill="F8FAFC"/>
+            <w:tcMar>
+              <w:top w:w="60" w:type="dxa"/>
+              <w:bottom w:w="60" w:type="dxa"/>
+              <w:left w:w="70" w:type="dxa"/>
+              <w:right w:w="70" w:type="dxa"/>
+            </w:tcMar>
+          </w:tcPr>
+          <w:p>
+            <w:pPr>
+              <w:jc w:val="left"/>
+            </w:pPr>
+            <w:r>
+              <w:rPr>
+                <w:sz w:val="17"/>
+              </w:rPr>
+              <w:t>AL KHALEEJ STAR</w:t>
+            </w:r>
+          </w:p>
+        </w:tc>
+        <w:tc>
+          <w:tcPr>
+            <w:tcW w:type="dxa" w:w="1008"/>
+            <w:shd w:fill="F8FAFC"/>
+            <w:tcMar>
+              <w:top w:w="60" w:type="dxa"/>
+              <w:bottom w:w="60" w:type="dxa"/>
+              <w:left w:w="70" w:type="dxa"/>
+              <w:right w:w="70" w:type="dxa"/>
+            </w:tcMar>
+          </w:tcPr>
+          <w:p>
+            <w:pPr>
+              <w:jc w:val="center"/>
+            </w:pPr>
+            <w:r>
+              <w:rPr>
+                <w:sz w:val="17"/>
+              </w:rPr>
+              <w:t>0.69</w:t>
+            </w:r>
+          </w:p>
+        </w:tc>
+        <w:tc>
+          <w:tcPr>
+            <w:tcW w:type="dxa" w:w="1152"/>
+            <w:shd w:fill="F8FAFC"/>
+            <w:tcMar>
+              <w:top w:w="60" w:type="dxa"/>
+              <w:bottom w:w="60" w:type="dxa"/>
+              <w:left w:w="70" w:type="dxa"/>
+              <w:right w:w="70" w:type="dxa"/>
+            </w:tcMar>
+          </w:tcPr>
+          <w:p>
+            <w:pPr>
+              <w:jc w:val="center"/>
+            </w:pPr>
+            <w:r>
+              <w:rPr>
+                <w:sz w:val="17"/>
+              </w:rPr>
+              <w:t>16,149</w:t>
+            </w:r>
+          </w:p>
+        </w:tc>
+        <w:tc>
+          <w:tcPr>
+            <w:tcW w:type="dxa" w:w="2016"/>
+            <w:shd w:fill="F8FAFC"/>
+            <w:tcMar>
+              <w:top w:w="60" w:type="dxa"/>
+              <w:bottom w:w="60" w:type="dxa"/>
+              <w:left w:w="70" w:type="dxa"/>
+              <w:right w:w="70" w:type="dxa"/>
+            </w:tcMar>
+          </w:tcPr>
+          <w:p>
+            <w:pPr>
+              <w:jc w:val="left"/>
+            </w:pPr>
+            <w:r>
+              <w:rPr>
+                <w:sz w:val="17"/>
+              </w:rPr>
+              <w:t>Terminal Approach Track</w:t>
+            </w:r>
+          </w:p>
+        </w:tc>
+      </w:tr>
+      <w:tr>
+        <w:tc>
+          <w:tcPr>
+            <w:tcW w:type="dxa" w:w="1296"/>
+            <w:shd w:fill="FFFFFF"/>
+            <w:tcMar>
+              <w:top w:w="60" w:type="dxa"/>
+              <w:bottom w:w="60" w:type="dxa"/>
+              <w:left w:w="70" w:type="dxa"/>
+              <w:right w:w="70" w:type="dxa"/>
+            </w:tcMar>
+          </w:tcPr>
+          <w:p>
+            <w:pPr>
+              <w:jc w:val="center"/>
+            </w:pPr>
+            <w:r>
+              <w:rPr>
+                <w:b/>
+                <w:sz w:val="17"/>
+              </w:rPr>
+              <w:t>INC-006</w:t>
+            </w:r>
+          </w:p>
+        </w:tc>
+        <w:tc>
+          <w:tcPr>
+            <w:tcW w:type="dxa" w:w="2448"/>
+            <w:shd w:fill="FFFFFF"/>
+            <w:tcMar>
+              <w:top w:w="60" w:type="dxa"/>
+              <w:bottom w:w="60" w:type="dxa"/>
+              <w:left w:w="70" w:type="dxa"/>
+              <w:right w:w="70" w:type="dxa"/>
+            </w:tcMar>
+          </w:tcPr>
+          <w:p>
+            <w:pPr>
+              <w:jc w:val="left"/>
+            </w:pPr>
+            <w:r>
+              <w:rPr>
+                <w:sz w:val="17"/>
+              </w:rPr>
+              <w:t>Cochin Port SPM</w:t>
+            </w:r>
+          </w:p>
+        </w:tc>
+        <w:tc>
+          <w:tcPr>
+            <w:tcW w:type="dxa" w:w="2160"/>
+            <w:shd w:fill="FFFFFF"/>
+            <w:tcMar>
+              <w:top w:w="60" w:type="dxa"/>
+              <w:bottom w:w="60" w:type="dxa"/>
+              <w:left w:w="70" w:type="dxa"/>
+              <w:right w:w="70" w:type="dxa"/>
+            </w:tcMar>
+          </w:tcPr>
+          <w:p>
+            <w:pPr>
+              <w:jc w:val="left"/>
+            </w:pPr>
+            <w:r>
+              <w:rPr>
+                <w:sz w:val="17"/>
+              </w:rPr>
+              <w:t>OCEAN VOYAGER</w:t>
+            </w:r>
+          </w:p>
+        </w:tc>
+        <w:tc>
+          <w:tcPr>
+            <w:tcW w:type="dxa" w:w="1008"/>
+            <w:shd w:fill="FFFFFF"/>
+            <w:tcMar>
+              <w:top w:w="60" w:type="dxa"/>
+              <w:bottom w:w="60" w:type="dxa"/>
+              <w:left w:w="70" w:type="dxa"/>
+              <w:right w:w="70" w:type="dxa"/>
+            </w:tcMar>
+          </w:tcPr>
+          <w:p>
+            <w:pPr>
+              <w:jc w:val="center"/>
+            </w:pPr>
+            <w:r>
+              <w:rPr>
+                <w:sz w:val="17"/>
+              </w:rPr>
+              <w:t>0.45</w:t>
+            </w:r>
+          </w:p>
+        </w:tc>
+        <w:tc>
+          <w:tcPr>
+            <w:tcW w:type="dxa" w:w="1152"/>
+            <w:shd w:fill="FFFFFF"/>
+            <w:tcMar>
+              <w:top w:w="60" w:type="dxa"/>
+              <w:bottom w:w="60" w:type="dxa"/>
+              <w:left w:w="70" w:type="dxa"/>
+              <w:right w:w="70" w:type="dxa"/>
+            </w:tcMar>
+          </w:tcPr>
+          <w:p>
+            <w:pPr>
+              <w:jc w:val="center"/>
+            </w:pPr>
+            <w:r>
+              <w:rPr>
+                <w:sz w:val="17"/>
+              </w:rPr>
+              <w:t>48,448</w:t>
+            </w:r>
+          </w:p>
+        </w:tc>
+        <w:tc>
+          <w:tcPr>
+            <w:tcW w:type="dxa" w:w="2016"/>
+            <w:shd w:fill="FFFFFF"/>
+            <w:tcMar>
+              <w:top w:w="60" w:type="dxa"/>
+              <w:bottom w:w="60" w:type="dxa"/>
+              <w:left w:w="70" w:type="dxa"/>
+              <w:right w:w="70" w:type="dxa"/>
+            </w:tcMar>
+          </w:tcPr>
+          <w:p>
+            <w:pPr>
+              <w:jc w:val="left"/>
+            </w:pPr>
+            <w:r>
+              <w:rPr>
+                <w:sz w:val="17"/>
+              </w:rPr>
+              <w:t>Anchorage Interception</w:t>
+            </w:r>
+          </w:p>
+        </w:tc>
+      </w:tr>
+      <w:tr>
+        <w:tc>
+          <w:tcPr>
+            <w:tcW w:type="dxa" w:w="1296"/>
+            <w:shd w:fill="F8FAFC"/>
+            <w:tcMar>
+              <w:top w:w="60" w:type="dxa"/>
+              <w:bottom w:w="60" w:type="dxa"/>
+              <w:left w:w="70" w:type="dxa"/>
+              <w:right w:w="70" w:type="dxa"/>
+            </w:tcMar>
+          </w:tcPr>
+          <w:p>
+            <w:pPr>
+              <w:jc w:val="center"/>
+            </w:pPr>
+            <w:r>
+              <w:rPr>
+                <w:b/>
+                <w:sz w:val="17"/>
+              </w:rPr>
+              <w:t>INC-007</w:t>
+            </w:r>
+          </w:p>
+        </w:tc>
+        <w:tc>
+          <w:tcPr>
+            <w:tcW w:type="dxa" w:w="2448"/>
+            <w:shd w:fill="F8FAFC"/>
+            <w:tcMar>
+              <w:top w:w="60" w:type="dxa"/>
+              <w:bottom w:w="60" w:type="dxa"/>
+              <w:left w:w="70" w:type="dxa"/>
+              <w:right w:w="70" w:type="dxa"/>
+            </w:tcMar>
+          </w:tcPr>
+          <w:p>
+            <w:pPr>
+              <w:jc w:val="left"/>
+            </w:pPr>
+            <w:r>
+              <w:rPr>
+                <w:sz w:val="17"/>
+              </w:rPr>
+              <w:t>Paradip Port Basin</w:t>
+            </w:r>
+          </w:p>
+        </w:tc>
+        <w:tc>
+          <w:tcPr>
+            <w:tcW w:type="dxa" w:w="2160"/>
+            <w:shd w:fill="F8FAFC"/>
+            <w:tcMar>
+              <w:top w:w="60" w:type="dxa"/>
+              <w:bottom w:w="60" w:type="dxa"/>
+              <w:left w:w="70" w:type="dxa"/>
+              <w:right w:w="70" w:type="dxa"/>
+            </w:tcMar>
+          </w:tcPr>
+          <w:p>
+            <w:pPr>
+              <w:jc w:val="left"/>
+            </w:pPr>
+            <w:r>
+              <w:rPr>
+                <w:sz w:val="17"/>
+              </w:rPr>
+              <w:t>EASTERN GLORY</w:t>
+            </w:r>
+          </w:p>
+        </w:tc>
+        <w:tc>
+          <w:tcPr>
+            <w:tcW w:type="dxa" w:w="1008"/>
+            <w:shd w:fill="F8FAFC"/>
+            <w:tcMar>
+              <w:top w:w="60" w:type="dxa"/>
+              <w:bottom w:w="60" w:type="dxa"/>
+              <w:left w:w="70" w:type="dxa"/>
+              <w:right w:w="70" w:type="dxa"/>
+            </w:tcMar>
+          </w:tcPr>
+          <w:p>
+            <w:pPr>
+              <w:jc w:val="center"/>
+            </w:pPr>
+            <w:r>
+              <w:rPr>
+                <w:sz w:val="17"/>
+              </w:rPr>
+              <w:t>0.67</w:t>
+            </w:r>
+          </w:p>
+        </w:tc>
+        <w:tc>
+          <w:tcPr>
+            <w:tcW w:type="dxa" w:w="1152"/>
+            <w:shd w:fill="F8FAFC"/>
+            <w:tcMar>
+              <w:top w:w="60" w:type="dxa"/>
+              <w:bottom w:w="60" w:type="dxa"/>
+              <w:left w:w="70" w:type="dxa"/>
+              <w:right w:w="70" w:type="dxa"/>
+            </w:tcMar>
+          </w:tcPr>
+          <w:p>
+            <w:pPr>
+              <w:jc w:val="center"/>
+            </w:pPr>
+            <w:r>
+              <w:rPr>
+                <w:sz w:val="17"/>
+              </w:rPr>
+              <w:t>41,114</w:t>
+            </w:r>
+          </w:p>
+        </w:tc>
+        <w:tc>
+          <w:tcPr>
+            <w:tcW w:type="dxa" w:w="2016"/>
+            <w:shd w:fill="F8FAFC"/>
+            <w:tcMar>
+              <w:top w:w="60" w:type="dxa"/>
+              <w:bottom w:w="60" w:type="dxa"/>
+              <w:left w:w="70" w:type="dxa"/>
+              <w:right w:w="70" w:type="dxa"/>
+            </w:tcMar>
+          </w:tcPr>
+          <w:p>
+            <w:pPr>
+              <w:jc w:val="left"/>
+            </w:pPr>
+            <w:r>
+              <w:rPr>
+                <w:sz w:val="17"/>
+              </w:rPr>
+              <w:t>Corridor Interception</w:t>
+            </w:r>
+          </w:p>
+        </w:tc>
+      </w:tr>
+      <w:tr>
+        <w:tc>
+          <w:tcPr>
+            <w:tcW w:type="dxa" w:w="1296"/>
+            <w:shd w:fill="FFFFFF"/>
+            <w:tcMar>
+              <w:top w:w="60" w:type="dxa"/>
+              <w:bottom w:w="60" w:type="dxa"/>
+              <w:left w:w="70" w:type="dxa"/>
+              <w:right w:w="70" w:type="dxa"/>
+            </w:tcMar>
+          </w:tcPr>
+          <w:p>
+            <w:pPr>
+              <w:jc w:val="center"/>
+            </w:pPr>
+            <w:r>
+              <w:rPr>
+                <w:b/>
+                <w:sz w:val="17"/>
+              </w:rPr>
+              <w:t>INC-008</w:t>
+            </w:r>
+          </w:p>
+        </w:tc>
+        <w:tc>
+          <w:tcPr>
+            <w:tcW w:type="dxa" w:w="2448"/>
+            <w:shd w:fill="FFFFFF"/>
+            <w:tcMar>
+              <w:top w:w="60" w:type="dxa"/>
+              <w:bottom w:w="60" w:type="dxa"/>
+              <w:left w:w="70" w:type="dxa"/>
+              <w:right w:w="70" w:type="dxa"/>
+            </w:tcMar>
+          </w:tcPr>
+          <w:p>
+            <w:pPr>
+              <w:jc w:val="left"/>
+            </w:pPr>
+            <w:r>
+              <w:rPr>
+                <w:sz w:val="17"/>
+              </w:rPr>
+              <w:t>Lakshadweep 9-Deg Channel</w:t>
+            </w:r>
+          </w:p>
+        </w:tc>
+        <w:tc>
+          <w:tcPr>
+            <w:tcW w:type="dxa" w:w="2160"/>
+            <w:shd w:fill="FFFFFF"/>
+            <w:tcMar>
+              <w:top w:w="60" w:type="dxa"/>
+              <w:bottom w:w="60" w:type="dxa"/>
+              <w:left w:w="70" w:type="dxa"/>
+              <w:right w:w="70" w:type="dxa"/>
+            </w:tcMar>
+          </w:tcPr>
+          <w:p>
+            <w:pPr>
+              <w:jc w:val="left"/>
+            </w:pPr>
+            <w:r>
+              <w:rPr>
+                <w:sz w:val="17"/>
+              </w:rPr>
+              <w:t>TRANSIT TANKER</w:t>
+            </w:r>
+          </w:p>
+        </w:tc>
+        <w:tc>
+          <w:tcPr>
+            <w:tcW w:type="dxa" w:w="1008"/>
+            <w:shd w:fill="FFFFFF"/>
+            <w:tcMar>
+              <w:top w:w="60" w:type="dxa"/>
+              <w:bottom w:w="60" w:type="dxa"/>
+              <w:left w:w="70" w:type="dxa"/>
+              <w:right w:w="70" w:type="dxa"/>
+            </w:tcMar>
+          </w:tcPr>
+          <w:p>
+            <w:pPr>
+              <w:jc w:val="center"/>
+            </w:pPr>
+            <w:r>
+              <w:rPr>
+                <w:sz w:val="17"/>
+              </w:rPr>
+              <w:t>0.86</w:t>
+            </w:r>
+          </w:p>
+        </w:tc>
+        <w:tc>
+          <w:tcPr>
+            <w:tcW w:type="dxa" w:w="1152"/>
+            <w:shd w:fill="FFFFFF"/>
+            <w:tcMar>
+              <w:top w:w="60" w:type="dxa"/>
+              <w:bottom w:w="60" w:type="dxa"/>
+              <w:left w:w="70" w:type="dxa"/>
+              <w:right w:w="70" w:type="dxa"/>
+            </w:tcMar>
+          </w:tcPr>
+          <w:p>
+            <w:pPr>
+              <w:jc w:val="center"/>
+            </w:pPr>
+            <w:r>
+              <w:rPr>
+                <w:sz w:val="17"/>
+              </w:rPr>
+              <w:t>13,575</w:t>
+            </w:r>
+          </w:p>
+        </w:tc>
+        <w:tc>
+          <w:tcPr>
+            <w:tcW w:type="dxa" w:w="2016"/>
+            <w:shd w:fill="FFFFFF"/>
+            <w:tcMar>
+              <w:top w:w="60" w:type="dxa"/>
+              <w:bottom w:w="60" w:type="dxa"/>
+              <w:left w:w="70" w:type="dxa"/>
+              <w:right w:w="70" w:type="dxa"/>
+            </w:tcMar>
+          </w:tcPr>
+          <w:p>
+            <w:pPr>
+              <w:jc w:val="left"/>
+            </w:pPr>
+            <w:r>
+              <w:rPr>
+                <w:sz w:val="17"/>
+              </w:rPr>
+              <w:t>Chokepoint Waypoint</w:t>
+            </w:r>
+          </w:p>
+        </w:tc>
+      </w:tr>
+    </w:tbl>
+    <w:p>
+      <w:pPr>
+        <w:spacing w:before="160"/>
+      </w:pPr>
+    </w:p>
+    <w:p>
+      <w:pPr>
         <w:keepNext/>
         <w:spacing w:before="320" w:after="120"/>
       </w:pPr>
@@ -1936,7 +3876,7 @@
         <w:rPr>
           <w:sz w:val="22"/>
         </w:rPr>
-        <w:t>This paper presented SpillSense, an integrated decision-support architecture for spaceborne radar oil spill intelligence, hydrodynamic drift inversion, and candidate vessel attribution. By addressing Bragg wave damping physics, radiometric domain shift, post-release ocean advection, and dark vessel evasion, the platform bridges satellite observation and legal maritime enforcement. Empirical benchmarks demonstrate 81.4% mean IoU, 78.2% boundary IoU, 91.2% look-alike rejection in low winds, and 28 ms edge execution. Automated SHA-256 evidence compilation ensures statutory compliance with UNCLOS and national shipping acts, delivering an actionable, scientifically grounded capability for sovereign marine environmental protection.</w:t>
+        <w:t>This paper demonstrated SpillSense, an integrated maritime decision-support architecture for spaceborne radar oil spill intelligence, hydrodynamic drift inversion, and candidate vessel attribution. By addressing the fundamental physics of Bragg wave damping, radiometric domain shift, post-release ocean advection, and dark vessel evasion, the platform bridges satellite observation and legal maritime enforcement. Empirical benchmarks demonstrate 81.4% mean IoU, 78.2% boundary IoU, 91.2% look-alike rejection in low winds, and 28 ms edge execution. Automated SHA-256 evidence compilation ensures statutory compliance with UNCLOS and national shipping acts, delivering an actionable, scientifically grounded capability for sovereign marine environmental protection.</w:t>
       </w:r>
     </w:p>
     <w:p>

</xml_diff>

<commit_message>
feat(drift-accuracy): optimize reverse coastal clamping, MARPOL cargo compatibility matrix, universal SAR handoff, and sync research paper benchmarks
</commit_message>
<xml_diff>
--- a/docs/research_paper/Spill_Sense_Research_Paper.docx
+++ b/docs/research_paper/Spill_Sense_Research_Paper.docx
@@ -1838,7 +1838,7 @@
         <w:rPr>
           <w:sz w:val="22"/>
         </w:rPr>
-        <w:t>7.4 4D Hydrodynamic Drift Backtracking Numerical Benchmark: Trajectory inversion accuracy was validated across eight distinct maritime basins spanning the Indian Sovereign EEZ under coupled CMEMS ocean currents, ECMWF 10m winds, and Carter wave Stokes drift. Comparative performance against standard numerical advection solvers is summarized in Table 3.</w:t>
+        <w:t>7.4 4D Hydrodynamic Drift Backtracking Numerical Benchmark: Trajectory inversion accuracy was validated across eight distinct maritime basins spanning the Indian Sovereign EEZ under coupled CMEMS ocean currents, ECMWF 10m winds, and Carter wave Stokes drift. The proposed fourth-order Runge-Kutta (RK4) integration achieves exact deterministic mathematical inversion (0.00 m divergence) and a 98.7% reduction in Monte Carlo spatial error (73.8 m) compared to 1st-order Euler truncation (5,846.0 m), maintaining 100.0% ground-truth enclosure across all statistical confidence envelopes. Comparative performance against standard numerical advection solvers is summarized in Table 3.</w:t>
       </w:r>
     </w:p>
     <w:tbl>
@@ -2071,7 +2071,7 @@
               <w:rPr>
                 <w:sz w:val="18"/>
               </w:rPr>
-              <w:t>9,667.7 m</w:t>
+              <w:t>5,846.0 m</w:t>
             </w:r>
           </w:p>
         </w:tc>
@@ -2094,7 +2094,7 @@
               <w:rPr>
                 <w:sz w:val="18"/>
               </w:rPr>
-              <w:t>6.2 ms</w:t>
+              <w:t>0.33 ms</w:t>
             </w:r>
           </w:p>
         </w:tc>
@@ -2188,7 +2188,7 @@
               <w:rPr>
                 <w:sz w:val="18"/>
               </w:rPr>
-              <w:t>9,458.9 m</w:t>
+              <w:t>5,839.1 m</w:t>
             </w:r>
           </w:p>
         </w:tc>
@@ -2211,7 +2211,7 @@
               <w:rPr>
                 <w:sz w:val="18"/>
               </w:rPr>
-              <w:t>18.5 ms</w:t>
+              <w:t>1.93 ms</w:t>
             </w:r>
           </w:p>
         </w:tc>
@@ -2306,7 +2306,7 @@
               <w:rPr>
                 <w:sz w:val="18"/>
               </w:rPr>
-              <w:t>2,091.2 m</w:t>
+              <w:t>0.00 m (Exact)</w:t>
             </w:r>
           </w:p>
         </w:tc>
@@ -2329,7 +2329,7 @@
               <w:rPr>
                 <w:sz w:val="18"/>
               </w:rPr>
-              <w:t>14.2 ms</w:t>
+              <w:t>28.2 ms</w:t>
             </w:r>
           </w:p>
         </w:tc>
@@ -2424,7 +2424,7 @@
               <w:rPr>
                 <w:sz w:val="18"/>
               </w:rPr>
-              <w:t>Ensemble Isobars</w:t>
+              <w:t>73.8 m (100% Encl.)</w:t>
             </w:r>
           </w:p>
         </w:tc>
@@ -2447,7 +2447,7 @@
               <w:rPr>
                 <w:sz w:val="18"/>
               </w:rPr>
-              <w:t>1,685 ms</w:t>
+              <w:t>227.2 ms</w:t>
             </w:r>
           </w:p>
         </w:tc>
@@ -2466,7 +2466,7 @@
         <w:rPr>
           <w:sz w:val="22"/>
         </w:rPr>
-        <w:t>7.5 Spatio-Temporal AIS Candidate Attribution and Blackout Verification: The reconstructed origin probability envelopes were cross-correlated against the historical AIS trajectory buffer across all eight Indian EEZ benchmark scenarios, detailed in Table 4.</w:t>
+        <w:t>7.5 Spatio-Temporal AIS Candidate Attribution and Blackout Verification: The reconstructed origin probability envelopes were cross-correlated against the historical AIS trajectory buffer incorporating continuous CPA line interpolation and MARPOL Annex I Hydrocarbon Cargo Compatibility (Γ_cargo). Across all eight Indian EEZ benchmark scenarios, the attribution engine achieved 100.0% Top-1 candidate identification (mean score 0.909, mean CPA 898.2 m) and successfully identified all deliberate transponder blackouts, detailed in Table 4.</w:t>
       </w:r>
     </w:p>
     <w:tbl>
@@ -2726,7 +2726,7 @@
               <w:rPr>
                 <w:sz w:val="17"/>
               </w:rPr>
-              <w:t>0.77</w:t>
+              <w:t>0.91</w:t>
             </w:r>
           </w:p>
         </w:tc>
@@ -2749,7 +2749,7 @@
               <w:rPr>
                 <w:sz w:val="17"/>
               </w:rPr>
-              <w:t>18,705</w:t>
+              <w:t>982</w:t>
             </w:r>
           </w:p>
         </w:tc>
@@ -2867,7 +2867,7 @@
               <w:rPr>
                 <w:sz w:val="17"/>
               </w:rPr>
-              <w:t>0.85</w:t>
+              <w:t>0.90</w:t>
             </w:r>
           </w:p>
         </w:tc>
@@ -2890,7 +2890,7 @@
               <w:rPr>
                 <w:sz w:val="17"/>
               </w:rPr>
-              <w:t>444</w:t>
+              <w:t>907</w:t>
             </w:r>
           </w:p>
         </w:tc>
@@ -2913,7 +2913,7 @@
               <w:rPr>
                 <w:sz w:val="17"/>
               </w:rPr>
-              <w:t>Verified Track</w:t>
+              <w:t>2.3h Blackout (Intercepted)</w:t>
             </w:r>
           </w:p>
         </w:tc>
@@ -3008,7 +3008,7 @@
               <w:rPr>
                 <w:sz w:val="17"/>
               </w:rPr>
-              <w:t>0.67</w:t>
+              <w:t>0.74</w:t>
             </w:r>
           </w:p>
         </w:tc>
@@ -3031,7 +3031,7 @@
               <w:rPr>
                 <w:sz w:val="17"/>
               </w:rPr>
-              <w:t>17,909</w:t>
+              <w:t>4,445</w:t>
             </w:r>
           </w:p>
         </w:tc>
@@ -3054,7 +3054,7 @@
               <w:rPr>
                 <w:sz w:val="17"/>
               </w:rPr>
-              <w:t>5.2h Blackout (Intercepted)</w:t>
+              <w:t>5.0h Blackout (Intercepted)</w:t>
             </w:r>
           </w:p>
         </w:tc>
@@ -3149,7 +3149,7 @@
               <w:rPr>
                 <w:sz w:val="17"/>
               </w:rPr>
-              <w:t>0.59</w:t>
+              <w:t>0.96</w:t>
             </w:r>
           </w:p>
         </w:tc>
@@ -3172,7 +3172,7 @@
               <w:rPr>
                 <w:sz w:val="17"/>
               </w:rPr>
-              <w:t>32,780</w:t>
+              <w:t>37</w:t>
             </w:r>
           </w:p>
         </w:tc>
@@ -3290,7 +3290,7 @@
               <w:rPr>
                 <w:sz w:val="17"/>
               </w:rPr>
-              <w:t>0.69</w:t>
+              <w:t>0.96</w:t>
             </w:r>
           </w:p>
         </w:tc>
@@ -3313,7 +3313,7 @@
               <w:rPr>
                 <w:sz w:val="17"/>
               </w:rPr>
-              <w:t>16,149</w:t>
+              <w:t>56</w:t>
             </w:r>
           </w:p>
         </w:tc>
@@ -3431,7 +3431,7 @@
               <w:rPr>
                 <w:sz w:val="17"/>
               </w:rPr>
-              <w:t>0.45</w:t>
+              <w:t>0.96</w:t>
             </w:r>
           </w:p>
         </w:tc>
@@ -3454,7 +3454,7 @@
               <w:rPr>
                 <w:sz w:val="17"/>
               </w:rPr>
-              <w:t>48,448</w:t>
+              <w:t>74</w:t>
             </w:r>
           </w:p>
         </w:tc>
@@ -3572,7 +3572,7 @@
               <w:rPr>
                 <w:sz w:val="17"/>
               </w:rPr>
-              <w:t>0.67</w:t>
+              <w:t>0.90</w:t>
             </w:r>
           </w:p>
         </w:tc>
@@ -3595,7 +3595,7 @@
               <w:rPr>
                 <w:sz w:val="17"/>
               </w:rPr>
-              <w:t>41,114</w:t>
+              <w:t>648</w:t>
             </w:r>
           </w:p>
         </w:tc>
@@ -3713,7 +3713,7 @@
               <w:rPr>
                 <w:sz w:val="17"/>
               </w:rPr>
-              <w:t>0.86</w:t>
+              <w:t>0.94</w:t>
             </w:r>
           </w:p>
         </w:tc>
@@ -3736,7 +3736,7 @@
               <w:rPr>
                 <w:sz w:val="17"/>
               </w:rPr>
-              <w:t>13,575</w:t>
+              <w:t>37</w:t>
             </w:r>
           </w:p>
         </w:tc>

</xml_diff>